<commit_message>
Proje guncellemeleri, sepet ve export ozellikleri, guvenlik ve dokumantasyon
</commit_message>
<xml_diff>
--- a/wwwroot/templates/2.docx
+++ b/wwwroot/templates/2.docx
@@ -10,24 +10,18 @@
         <w:t>g</w:t>
       </w:r>
       <w:r>
-        <w:t xml:space="preserve"> </w:t>
+        <w:t xml:space="preserve"> mg</w:t>
       </w:r>
-      <w:proofErr w:type="spellStart"/>
-      <w:r>
-        <w:t>mg</w:t>
-      </w:r>
-      <w:proofErr w:type="spellEnd"/>
       <w:r>
         <w:t>_</w:t>
       </w:r>
     </w:p>
+    <w:p/>
     <w:p>
       <w:r>
-        <w:t>{SORULAR}</w:t>
+        <w:t>{baslik}</w:t>
       </w:r>
     </w:p>
-    <w:p/>
-    <w:p/>
     <w:p/>
     <w:tbl>
       <w:tblPr>
@@ -36,12 +30,42 @@
         <w:tblLook w:val="04A0" w:firstRow="1" w:lastRow="0" w:firstColumn="1" w:lastColumn="0" w:noHBand="0" w:noVBand="1"/>
       </w:tblPr>
       <w:tblGrid>
-        <w:gridCol w:w="5517"/>
+        <w:gridCol w:w="589"/>
+        <w:gridCol w:w="4928"/>
       </w:tblGrid>
       <w:tr>
         <w:tc>
           <w:tcPr>
-            <w:tcW w:w="5517" w:type="dxa"/>
+            <w:tcW w:w="279" w:type="dxa"/>
+          </w:tcPr>
+          <w:p>
+            <w:r>
+              <w:t>{no}</w:t>
+            </w:r>
+          </w:p>
+        </w:tc>
+        <w:tc>
+          <w:tcPr>
+            <w:tcW w:w="5238" w:type="dxa"/>
+          </w:tcPr>
+          <w:p>
+            <w:r>
+              <w:t>{SORULAR}</w:t>
+            </w:r>
+          </w:p>
+          <w:p/>
+        </w:tc>
+      </w:tr>
+      <w:tr>
+        <w:tc>
+          <w:tcPr>
+            <w:tcW w:w="279" w:type="dxa"/>
+          </w:tcPr>
+          <w:p/>
+        </w:tc>
+        <w:tc>
+          <w:tcPr>
+            <w:tcW w:w="5238" w:type="dxa"/>
           </w:tcPr>
           <w:p/>
         </w:tc>
@@ -49,7 +73,13 @@
       <w:tr>
         <w:tc>
           <w:tcPr>
-            <w:tcW w:w="5517" w:type="dxa"/>
+            <w:tcW w:w="279" w:type="dxa"/>
+          </w:tcPr>
+          <w:p/>
+        </w:tc>
+        <w:tc>
+          <w:tcPr>
+            <w:tcW w:w="5238" w:type="dxa"/>
           </w:tcPr>
           <w:p/>
         </w:tc>
@@ -57,7 +87,13 @@
       <w:tr>
         <w:tc>
           <w:tcPr>
-            <w:tcW w:w="5517" w:type="dxa"/>
+            <w:tcW w:w="279" w:type="dxa"/>
+          </w:tcPr>
+          <w:p/>
+        </w:tc>
+        <w:tc>
+          <w:tcPr>
+            <w:tcW w:w="5238" w:type="dxa"/>
           </w:tcPr>
           <w:p/>
         </w:tc>
@@ -65,7 +101,13 @@
       <w:tr>
         <w:tc>
           <w:tcPr>
-            <w:tcW w:w="5517" w:type="dxa"/>
+            <w:tcW w:w="279" w:type="dxa"/>
+          </w:tcPr>
+          <w:p/>
+        </w:tc>
+        <w:tc>
+          <w:tcPr>
+            <w:tcW w:w="5238" w:type="dxa"/>
           </w:tcPr>
           <w:p/>
         </w:tc>
@@ -73,21 +115,24 @@
       <w:tr>
         <w:tc>
           <w:tcPr>
-            <w:tcW w:w="5517" w:type="dxa"/>
+            <w:tcW w:w="279" w:type="dxa"/>
           </w:tcPr>
           <w:p/>
         </w:tc>
-      </w:tr>
-      <w:tr>
         <w:tc>
           <w:tcPr>
-            <w:tcW w:w="5517" w:type="dxa"/>
+            <w:tcW w:w="5238" w:type="dxa"/>
           </w:tcPr>
           <w:p/>
         </w:tc>
       </w:tr>
     </w:tbl>
     <w:p/>
+    <w:p>
+      <w:r>
+        <w:t>{anahtar}</w:t>
+      </w:r>
+    </w:p>
     <w:sectPr>
       <w:pgSz w:w="11906" w:h="16838"/>
       <w:pgMar w:top="425" w:right="340" w:bottom="425" w:left="284" w:header="709" w:footer="709" w:gutter="0"/>

</xml_diff>